<commit_message>
feat(lab2): add Sleuth Kit evidence to the NTFS guide
</commit_message>
<xml_diff>
--- a/laboratorio2/informe/Guia_Laboratorio_NTFS.docx
+++ b/laboratorio2/informe/Guia_Laboratorio_NTFS.docx
@@ -7542,7 +7542,7 @@
           <w:sz w:val="24"/>
           <w:szCs w:val="24"/>
         </w:rPr>
-        <w:t xml:space="preserve"> lista </w:t>
+        <w:t xml:space="preserve"> muestra la línea </w:t>
       </w:r>
       <w:r>
         <w:rPr>
@@ -7550,15 +7550,31 @@
           <w:sz w:val="22"/>
           <w:szCs w:val="22"/>
         </w:rPr>
-        <w:t xml:space="preserve">LAB_NTFS.txt</w:t>
-      </w:r>
-      <w:r>
-        <w:rPr>
-          <w:rFonts w:ascii="Times New Roman" w:cs="Times New Roman" w:eastAsia="Times New Roman" w:hAnsi="Times New Roman"/>
-          <w:sz w:val="24"/>
-          <w:szCs w:val="24"/>
-        </w:rPr>
-        <w:t xml:space="preserve"> con su número de registro. A mano, se obtiene de la entrada del índice de la raíz (figura anterior): referencia </w:t>
+        <w:t xml:space="preserve">r/r 120-128-2: LAB_NTFS.txt</w:t>
+      </w:r>
+      <w:r>
+        <w:rPr>
+          <w:rFonts w:ascii="Times New Roman" w:cs="Times New Roman" w:eastAsia="Times New Roman" w:hAnsi="Times New Roman"/>
+          <w:sz w:val="24"/>
+          <w:szCs w:val="24"/>
+        </w:rPr>
+        <w:t xml:space="preserve">: registro 120, atributo tipo 128 (</w:t>
+      </w:r>
+      <w:r>
+        <w:rPr>
+          <w:rFonts w:ascii="Consolas" w:cs="Consolas" w:eastAsia="Consolas" w:hAnsi="Consolas"/>
+          <w:sz w:val="22"/>
+          <w:szCs w:val="22"/>
+        </w:rPr>
+        <w:t xml:space="preserve">$DATA</w:t>
+      </w:r>
+      <w:r>
+        <w:rPr>
+          <w:rFonts w:ascii="Times New Roman" w:cs="Times New Roman" w:eastAsia="Times New Roman" w:hAnsi="Times New Roman"/>
+          <w:sz w:val="24"/>
+          <w:szCs w:val="24"/>
+        </w:rPr>
+        <w:t xml:space="preserve">) con identificador 2. A mano, se obtiene de la entrada del índice de la raíz (figura anterior): referencia </w:t>
       </w:r>
       <w:r>
         <w:rPr>
@@ -12319,8 +12335,151 @@
     </w:p>
     <w:p>
       <w:pPr>
+        <w:spacing w:after="0" w:line="360"/>
+        <w:ind w:firstLine="720"/>
+        <w:jc w:val="left"/>
+      </w:pPr>
+      <w:r>
+        <w:rPr>
+          <w:rFonts w:ascii="Times New Roman" w:cs="Times New Roman" w:eastAsia="Times New Roman" w:hAnsi="Times New Roman"/>
+          <w:sz w:val="24"/>
+          <w:szCs w:val="24"/>
+        </w:rPr>
+        <w:t xml:space="preserve">Con The Sleuth Kit se obtuvieron los mismos valores sin ninguna discrepancia: </w:t>
+      </w:r>
+      <w:r>
+        <w:rPr>
+          <w:rFonts w:ascii="Consolas" w:cs="Consolas" w:eastAsia="Consolas" w:hAnsi="Consolas"/>
+          <w:sz w:val="22"/>
+          <w:szCs w:val="22"/>
+        </w:rPr>
+        <w:t xml:space="preserve">fsstat</w:t>
+      </w:r>
+      <w:r>
+        <w:rPr>
+          <w:rFonts w:ascii="Times New Roman" w:cs="Times New Roman" w:eastAsia="Times New Roman" w:hAnsi="Times New Roman"/>
+          <w:sz w:val="24"/>
+          <w:szCs w:val="24"/>
+        </w:rPr>
+        <w:t xml:space="preserve"> confirma el número de serie, el cluster 4 de la MFT, el 25 599 de </w:t>
+      </w:r>
+      <w:r>
+        <w:rPr>
+          <w:rFonts w:ascii="Consolas" w:cs="Consolas" w:eastAsia="Consolas" w:hAnsi="Consolas"/>
+          <w:sz w:val="22"/>
+          <w:szCs w:val="22"/>
+        </w:rPr>
+        <w:t xml:space="preserve">$MFTMirr</w:t>
+      </w:r>
+      <w:r>
+        <w:rPr>
+          <w:rFonts w:ascii="Times New Roman" w:cs="Times New Roman" w:eastAsia="Times New Roman" w:hAnsi="Times New Roman"/>
+          <w:sz w:val="24"/>
+          <w:szCs w:val="24"/>
+        </w:rPr>
+        <w:t xml:space="preserve">, los registros de 1024 bytes y el directorio raíz en el registro 5; </w:t>
+      </w:r>
+      <w:r>
+        <w:rPr>
+          <w:rFonts w:ascii="Consolas" w:cs="Consolas" w:eastAsia="Consolas" w:hAnsi="Consolas"/>
+          <w:sz w:val="22"/>
+          <w:szCs w:val="22"/>
+        </w:rPr>
+        <w:t xml:space="preserve">fls</w:t>
+      </w:r>
+      <w:r>
+        <w:rPr>
+          <w:rFonts w:ascii="Times New Roman" w:cs="Times New Roman" w:eastAsia="Times New Roman" w:hAnsi="Times New Roman"/>
+          <w:sz w:val="24"/>
+          <w:szCs w:val="24"/>
+        </w:rPr>
+        <w:t xml:space="preserve"> da el registro 120 de </w:t>
+      </w:r>
+      <w:r>
+        <w:rPr>
+          <w:rFonts w:ascii="Consolas" w:cs="Consolas" w:eastAsia="Consolas" w:hAnsi="Consolas"/>
+          <w:sz w:val="22"/>
+          <w:szCs w:val="22"/>
+        </w:rPr>
+        <w:t xml:space="preserve">LAB_NTFS.txt</w:t>
+      </w:r>
+      <w:r>
+        <w:rPr>
+          <w:rFonts w:ascii="Times New Roman" w:cs="Times New Roman" w:eastAsia="Times New Roman" w:hAnsi="Times New Roman"/>
+          <w:sz w:val="24"/>
+          <w:szCs w:val="24"/>
+        </w:rPr>
+        <w:t xml:space="preserve">, e </w:t>
+      </w:r>
+      <w:r>
+        <w:rPr>
+          <w:rFonts w:ascii="Consolas" w:cs="Consolas" w:eastAsia="Consolas" w:hAnsi="Consolas"/>
+          <w:sz w:val="22"/>
+          <w:szCs w:val="22"/>
+        </w:rPr>
+        <w:t xml:space="preserve">istat</w:t>
+      </w:r>
+      <w:r>
+        <w:rPr>
+          <w:rFonts w:ascii="Times New Roman" w:cs="Times New Roman" w:eastAsia="Times New Roman" w:hAnsi="Times New Roman"/>
+          <w:sz w:val="24"/>
+          <w:szCs w:val="24"/>
+        </w:rPr>
+        <w:t xml:space="preserve"> lista los mismos cinco atributos residentes, con </w:t>
+      </w:r>
+      <w:r>
+        <w:rPr>
+          <w:rFonts w:ascii="Consolas" w:cs="Consolas" w:eastAsia="Consolas" w:hAnsi="Consolas"/>
+          <w:sz w:val="22"/>
+          <w:szCs w:val="22"/>
+        </w:rPr>
+        <w:t xml:space="preserve">$DATA</w:t>
+      </w:r>
+      <w:r>
+        <w:rPr>
+          <w:rFonts w:ascii="Times New Roman" w:cs="Times New Roman" w:eastAsia="Times New Roman" w:hAnsi="Times New Roman"/>
+          <w:sz w:val="24"/>
+          <w:szCs w:val="24"/>
+        </w:rPr>
+        <w:t xml:space="preserve"> de 114 bytes. Además, el contenido extraído con </w:t>
+      </w:r>
+      <w:r>
+        <w:rPr>
+          <w:rFonts w:ascii="Consolas" w:cs="Consolas" w:eastAsia="Consolas" w:hAnsi="Consolas"/>
+          <w:sz w:val="22"/>
+          <w:szCs w:val="22"/>
+        </w:rPr>
+        <w:t xml:space="preserve">icat -o 2048 lab_ntfs_guia.img 120</w:t>
+      </w:r>
+      <w:r>
+        <w:rPr>
+          <w:rFonts w:ascii="Times New Roman" w:cs="Times New Roman" w:eastAsia="Times New Roman" w:hAnsi="Times New Roman"/>
+          <w:sz w:val="24"/>
+          <w:szCs w:val="24"/>
+        </w:rPr>
+        <w:t xml:space="preserve"> tiene el mismo SHA-256 (</w:t>
+      </w:r>
+      <w:r>
+        <w:rPr>
+          <w:rFonts w:ascii="Consolas" w:cs="Consolas" w:eastAsia="Consolas" w:hAnsi="Consolas"/>
+          <w:sz w:val="22"/>
+          <w:szCs w:val="22"/>
+        </w:rPr>
+        <w:t xml:space="preserve">ffef8fb0bb1ef274...</w:t>
+      </w:r>
+      <w:r>
+        <w:rPr>
+          <w:rFonts w:ascii="Times New Roman" w:cs="Times New Roman" w:eastAsia="Times New Roman" w:hAnsi="Times New Roman"/>
+          <w:sz w:val="24"/>
+          <w:szCs w:val="24"/>
+        </w:rPr>
+        <w:t xml:space="preserve">) que el texto original.</w:t>
+      </w:r>
+    </w:p>
+    <w:p>
+      <w:pPr>
         <w:keepNext/>
-        <w:spacing w:after="60" w:before="120" w:line="360"/>
+        <w:spacing w:after="0" w:before="120" w:line="276"/>
       </w:pPr>
       <w:r>
         <w:rPr>
@@ -12330,8 +12489,76 @@
           <w:sz w:val="24"/>
           <w:szCs w:val="24"/>
         </w:rPr>
-        <w:t xml:space="preserve">Nota. </w:t>
-      </w:r>
+        <w:t xml:space="preserve">Figura 15</w:t>
+      </w:r>
+    </w:p>
+    <w:p>
+      <w:pPr>
+        <w:keepNext/>
+        <w:spacing w:after="80" w:line="276"/>
+      </w:pPr>
+      <w:r>
+        <w:rPr>
+          <w:rFonts w:ascii="Times New Roman" w:cs="Times New Roman" w:eastAsia="Times New Roman" w:hAnsi="Times New Roman"/>
+          <w:i/>
+          <w:iCs/>
+          <w:sz w:val="24"/>
+          <w:szCs w:val="24"/>
+        </w:rPr>
+        <w:t xml:space="preserve">Parámetros del volumen con fsstat</w:t>
+      </w:r>
+    </w:p>
+    <w:p>
+      <w:pPr>
+        <w:spacing w:after="160" w:before="40"/>
+        <w:jc w:val="center"/>
+      </w:pPr>
+      <w:r>
+        <w:drawing>
+          <wp:inline distT="0" distB="0" distL="0" distR="0">
+            <wp:extent cx="3724275" cy="4572000"/>
+            <wp:effectExtent t="0" r="0" b="0" l="0"/>
+            <wp:docPr id="16" name="g13_tsk_fsstat.png" descr="Parámetros del volumen con fsstat" title="Parámetros del volumen con fsstat"/>
+            <wp:cNvGraphicFramePr>
+              <a:graphicFrameLocks xmlns:a="http://schemas.openxmlformats.org/drawingml/2006/main" noChangeAspect="1"/>
+            </wp:cNvGraphicFramePr>
+            <a:graphic xmlns:a="http://schemas.openxmlformats.org/drawingml/2006/main">
+              <a:graphicData uri="http://schemas.openxmlformats.org/drawingml/2006/picture">
+                <pic:pic xmlns:pic="http://schemas.openxmlformats.org/drawingml/2006/picture">
+                  <pic:nvPicPr>
+                    <pic:cNvPr id="0" name="" descr=""/>
+                    <pic:cNvPicPr>
+                      <a:picLocks noChangeAspect="1" noChangeArrowheads="1"/>
+                    </pic:cNvPicPr>
+                  </pic:nvPicPr>
+                  <pic:blipFill>
+                    <a:blip r:embed="rId23" cstate="none"/>
+                    <a:srcRect/>
+                    <a:stretch>
+                      <a:fillRect/>
+                    </a:stretch>
+                  </pic:blipFill>
+                  <pic:spPr bwMode="auto">
+                    <a:xfrm>
+                      <a:off x="0" y="0"/>
+                      <a:ext cx="3724275" cy="4572000"/>
+                    </a:xfrm>
+                    <a:prstGeom prst="rect">
+                      <a:avLst/>
+                    </a:prstGeom>
+                  </pic:spPr>
+                </pic:pic>
+              </a:graphicData>
+            </a:graphic>
+          </wp:inline>
+        </w:drawing>
+      </w:r>
+    </w:p>
+    <w:p>
+      <w:pPr>
+        <w:keepNext/>
+        <w:spacing w:after="0" w:before="120" w:line="276"/>
+      </w:pPr>
       <w:r>
         <w:rPr>
           <w:rFonts w:ascii="Times New Roman" w:cs="Times New Roman" w:eastAsia="Times New Roman" w:hAnsi="Times New Roman"/>
@@ -12340,71 +12567,147 @@
           <w:sz w:val="24"/>
           <w:szCs w:val="24"/>
         </w:rPr>
-        <w:t xml:space="preserve">Contraste con The Sleuth Kit:</w:t>
+        <w:t xml:space="preserve">Figura 16</w:t>
       </w:r>
     </w:p>
     <w:p>
       <w:pPr>
         <w:keepNext/>
-        <w:keepLines/>
-        <w:spacing w:after="0" w:line="300"/>
-        <w:ind w:left="720"/>
-      </w:pPr>
-      <w:r>
-        <w:rPr>
-          <w:rFonts w:ascii="Consolas" w:cs="Consolas" w:eastAsia="Consolas" w:hAnsi="Consolas"/>
-          <w:sz w:val="20"/>
-          <w:szCs w:val="20"/>
-        </w:rPr>
-        <w:t xml:space="preserve">fsstat -o 2048 lab_ntfs_guia.img</w:t>
+        <w:spacing w:after="80" w:line="276"/>
+      </w:pPr>
+      <w:r>
+        <w:rPr>
+          <w:rFonts w:ascii="Times New Roman" w:cs="Times New Roman" w:eastAsia="Times New Roman" w:hAnsi="Times New Roman"/>
+          <w:i/>
+          <w:iCs/>
+          <w:sz w:val="24"/>
+          <w:szCs w:val="24"/>
+        </w:rPr>
+        <w:t xml:space="preserve">Entradas de la raíz con fls</w:t>
+      </w:r>
+    </w:p>
+    <w:p>
+      <w:pPr>
+        <w:spacing w:after="160" w:before="40"/>
+        <w:jc w:val="center"/>
+      </w:pPr>
+      <w:r>
+        <w:drawing>
+          <wp:inline distT="0" distB="0" distL="0" distR="0">
+            <wp:extent cx="2324100" cy="4572000"/>
+            <wp:effectExtent t="0" r="0" b="0" l="0"/>
+            <wp:docPr id="17" name="g14_tsk_fls.png" descr="Entradas de la raíz con fls" title="Entradas de la raíz con fls"/>
+            <wp:cNvGraphicFramePr>
+              <a:graphicFrameLocks xmlns:a="http://schemas.openxmlformats.org/drawingml/2006/main" noChangeAspect="1"/>
+            </wp:cNvGraphicFramePr>
+            <a:graphic xmlns:a="http://schemas.openxmlformats.org/drawingml/2006/main">
+              <a:graphicData uri="http://schemas.openxmlformats.org/drawingml/2006/picture">
+                <pic:pic xmlns:pic="http://schemas.openxmlformats.org/drawingml/2006/picture">
+                  <pic:nvPicPr>
+                    <pic:cNvPr id="0" name="" descr=""/>
+                    <pic:cNvPicPr>
+                      <a:picLocks noChangeAspect="1" noChangeArrowheads="1"/>
+                    </pic:cNvPicPr>
+                  </pic:nvPicPr>
+                  <pic:blipFill>
+                    <a:blip r:embed="rId24" cstate="none"/>
+                    <a:srcRect/>
+                    <a:stretch>
+                      <a:fillRect/>
+                    </a:stretch>
+                  </pic:blipFill>
+                  <pic:spPr bwMode="auto">
+                    <a:xfrm>
+                      <a:off x="0" y="0"/>
+                      <a:ext cx="2324100" cy="4572000"/>
+                    </a:xfrm>
+                    <a:prstGeom prst="rect">
+                      <a:avLst/>
+                    </a:prstGeom>
+                  </pic:spPr>
+                </pic:pic>
+              </a:graphicData>
+            </a:graphic>
+          </wp:inline>
+        </w:drawing>
       </w:r>
     </w:p>
     <w:p>
       <w:pPr>
         <w:keepNext/>
-        <w:keepLines/>
-        <w:spacing w:after="0" w:line="300"/>
-        <w:ind w:left="720"/>
-      </w:pPr>
-      <w:r>
-        <w:rPr>
-          <w:rFonts w:ascii="Consolas" w:cs="Consolas" w:eastAsia="Consolas" w:hAnsi="Consolas"/>
-          <w:sz w:val="20"/>
-          <w:szCs w:val="20"/>
-        </w:rPr>
-        <w:t xml:space="preserve">fls -o 2048 lab_ntfs_guia.img</w:t>
+        <w:spacing w:after="0" w:before="120" w:line="276"/>
+      </w:pPr>
+      <w:r>
+        <w:rPr>
+          <w:rFonts w:ascii="Times New Roman" w:cs="Times New Roman" w:eastAsia="Times New Roman" w:hAnsi="Times New Roman"/>
+          <w:b/>
+          <w:bCs/>
+          <w:sz w:val="24"/>
+          <w:szCs w:val="24"/>
+        </w:rPr>
+        <w:t xml:space="preserve">Figura 17</w:t>
       </w:r>
     </w:p>
     <w:p>
       <w:pPr>
         <w:keepNext/>
-        <w:keepLines/>
-        <w:spacing w:after="0" w:line="300"/>
-        <w:ind w:left="720"/>
-      </w:pPr>
-      <w:r>
-        <w:rPr>
-          <w:rFonts w:ascii="Consolas" w:cs="Consolas" w:eastAsia="Consolas" w:hAnsi="Consolas"/>
-          <w:sz w:val="20"/>
-          <w:szCs w:val="20"/>
-        </w:rPr>
-        <w:t xml:space="preserve">istat -o 2048 lab_ntfs_guia.img 120</w:t>
-      </w:r>
-    </w:p>
-    <w:p>
-      <w:pPr>
-        <w:keepNext w:val="false"/>
-        <w:keepLines/>
-        <w:spacing w:after="160" w:line="300"/>
-        <w:ind w:left="720"/>
-      </w:pPr>
-      <w:r>
-        <w:rPr>
-          <w:rFonts w:ascii="Consolas" w:cs="Consolas" w:eastAsia="Consolas" w:hAnsi="Consolas"/>
-          <w:sz w:val="20"/>
-          <w:szCs w:val="20"/>
-        </w:rPr>
-        <w:t xml:space="preserve">icat -o 2048 lab_ntfs_guia.img 120</w:t>
+        <w:spacing w:after="80" w:line="276"/>
+      </w:pPr>
+      <w:r>
+        <w:rPr>
+          <w:rFonts w:ascii="Times New Roman" w:cs="Times New Roman" w:eastAsia="Times New Roman" w:hAnsi="Times New Roman"/>
+          <w:i/>
+          <w:iCs/>
+          <w:sz w:val="24"/>
+          <w:szCs w:val="24"/>
+        </w:rPr>
+        <w:t xml:space="preserve">Atributos del registro 120 con istat</w:t>
+      </w:r>
+    </w:p>
+    <w:p>
+      <w:pPr>
+        <w:spacing w:after="160" w:before="40"/>
+        <w:jc w:val="center"/>
+      </w:pPr>
+      <w:r>
+        <w:drawing>
+          <wp:inline distT="0" distB="0" distL="0" distR="0">
+            <wp:extent cx="4610100" cy="5486400"/>
+            <wp:effectExtent t="0" r="0" b="0" l="0"/>
+            <wp:docPr id="18" name="g15_tsk_istat.png" descr="Atributos del registro 120 con istat" title="Atributos del registro 120 con istat"/>
+            <wp:cNvGraphicFramePr>
+              <a:graphicFrameLocks xmlns:a="http://schemas.openxmlformats.org/drawingml/2006/main" noChangeAspect="1"/>
+            </wp:cNvGraphicFramePr>
+            <a:graphic xmlns:a="http://schemas.openxmlformats.org/drawingml/2006/main">
+              <a:graphicData uri="http://schemas.openxmlformats.org/drawingml/2006/picture">
+                <pic:pic xmlns:pic="http://schemas.openxmlformats.org/drawingml/2006/picture">
+                  <pic:nvPicPr>
+                    <pic:cNvPr id="0" name="" descr=""/>
+                    <pic:cNvPicPr>
+                      <a:picLocks noChangeAspect="1" noChangeArrowheads="1"/>
+                    </pic:cNvPicPr>
+                  </pic:nvPicPr>
+                  <pic:blipFill>
+                    <a:blip r:embed="rId25" cstate="none"/>
+                    <a:srcRect/>
+                    <a:stretch>
+                      <a:fillRect/>
+                    </a:stretch>
+                  </pic:blipFill>
+                  <pic:spPr bwMode="auto">
+                    <a:xfrm>
+                      <a:off x="0" y="0"/>
+                      <a:ext cx="4610100" cy="5486400"/>
+                    </a:xfrm>
+                    <a:prstGeom prst="rect">
+                      <a:avLst/>
+                    </a:prstGeom>
+                  </pic:spPr>
+                </pic:pic>
+              </a:graphicData>
+            </a:graphic>
+          </wp:inline>
+        </w:drawing>
       </w:r>
     </w:p>
     <w:p>

</xml_diff>

<commit_message>
fix(lab2): harden NTFS guide image build and read volatile values from the image
</commit_message>
<xml_diff>
--- a/laboratorio2/informe/Guia_Laboratorio_NTFS.docx
+++ b/laboratorio2/informe/Guia_Laboratorio_NTFS.docx
@@ -7165,7 +7165,7 @@
                 <w:sz w:val="20"/>
                 <w:szCs w:val="20"/>
               </w:rPr>
-              <w:t xml:space="preserve">2026-10-24 11:10:32 (UTC-5)</w:t>
+              <w:t xml:space="preserve">2026-10-24 16:40:59 UTC</w:t>
             </w:r>
           </w:p>
         </w:tc>
@@ -9141,7 +9141,7 @@
                 <w:sz w:val="20"/>
                 <w:szCs w:val="20"/>
               </w:rPr>
-              <w:t xml:space="preserve">Fechas de creación, modificación y acceso (2026-10-24 16:10:32 UTC) y atributos DOS</w:t>
+              <w:t xml:space="preserve">Fechas de creación, modificación y acceso (2026-10-24 16:40:59 UTC) y atributos DOS</w:t>
             </w:r>
           </w:p>
         </w:tc>

</xml_diff>